<commit_message>
Update AZ-400 courseware documents
</commit_message>
<xml_diff>
--- a/courseware/LG-Designing and Implementing Microsoft DevOps Solutions (AZ-400).docx
+++ b/courseware/LG-Designing and Implementing Microsoft DevOps Solutions (AZ-400).docx
@@ -4,53 +4,28 @@
   <w:body>
     <w:p>
       <w:pPr>
-        <w:jc w:val="center"/>
-      </w:pPr>
-      <w:r>
-        <w:rPr>
-          <w:rFonts w:ascii="Arial" w:hAnsi="Arial"/>
-          <w:b/>
-          <w:color w:val="111827"/>
-          <w:sz w:val="22"/>
-        </w:rPr>
-        <w:t>Tertiary Infotech Academy Pte Ltd</w:t>
-      </w:r>
+        <w:spacing w:after="80"/>
+      </w:pPr>
     </w:p>
     <w:p>
       <w:pPr>
-        <w:jc w:val="center"/>
-      </w:pPr>
-      <w:r>
-        <w:rPr>
-          <w:rFonts w:ascii="Arial" w:hAnsi="Arial"/>
-          <w:b w:val="0"/>
-          <w:color w:val="4B5563"/>
-          <w:sz w:val="20"/>
-        </w:rPr>
-        <w:t>UEN: 201200696W</w:t>
-      </w:r>
+        <w:spacing w:after="80"/>
+      </w:pPr>
     </w:p>
     <w:p>
       <w:pPr>
-        <w:shd w:fill="1F6FEB"/>
-      </w:pPr>
-      <w:r>
-        <w:rPr>
-          <w:rFonts w:ascii="Arial" w:hAnsi="Arial"/>
-          <w:b w:val="0"/>
-          <w:sz w:val="4"/>
-        </w:rPr>
-        <w:t xml:space="preserve"> </w:t>
-      </w:r>
+        <w:spacing w:after="80"/>
+      </w:pPr>
     </w:p>
     <w:p>
       <w:pPr>
+        <w:spacing w:after="240"/>
         <w:jc w:val="center"/>
       </w:pPr>
       <w:r>
         <w:drawing>
           <wp:inline xmlns:a="http://schemas.openxmlformats.org/drawingml/2006/main" xmlns:pic="http://schemas.openxmlformats.org/drawingml/2006/picture">
-            <wp:extent cx="685800" cy="685800"/>
+            <wp:extent cx="1600200" cy="1600200"/>
             <wp:docPr id="1" name="Picture 1"/>
             <wp:cNvGraphicFramePr>
               <a:graphicFrameLocks noChangeAspect="1"/>
@@ -71,7 +46,7 @@
                   <pic:spPr>
                     <a:xfrm>
                       <a:off x="0" y="0"/>
-                      <a:ext cx="685800" cy="685800"/>
+                      <a:ext cx="1600200" cy="1600200"/>
                     </a:xfrm>
                     <a:prstGeom prst="rect"/>
                   </pic:spPr>
@@ -84,8 +59,68 @@
     </w:p>
     <w:p>
       <w:pPr>
+        <w:spacing w:after="20"/>
         <w:jc w:val="center"/>
-        <w:shd w:fill="F3F7FB"/>
+      </w:pPr>
+      <w:r>
+        <w:rPr>
+          <w:rFonts w:ascii="Arial" w:hAnsi="Arial"/>
+          <w:b/>
+          <w:color w:val="111827"/>
+          <w:sz w:val="26"/>
+        </w:rPr>
+        <w:t>Tertiary Infotech Academy Pte Ltd</w:t>
+      </w:r>
+    </w:p>
+    <w:p>
+      <w:pPr>
+        <w:spacing w:after="440"/>
+        <w:jc w:val="center"/>
+      </w:pPr>
+      <w:r>
+        <w:rPr>
+          <w:rFonts w:ascii="Arial" w:hAnsi="Arial"/>
+          <w:b w:val="0"/>
+          <w:color w:val="4B5563"/>
+          <w:sz w:val="20"/>
+        </w:rPr>
+        <w:t>UEN: 201200696W</w:t>
+      </w:r>
+    </w:p>
+    <w:p>
+      <w:pPr>
+        <w:spacing w:after="240"/>
+        <w:jc w:val="center"/>
+      </w:pPr>
+      <w:r>
+        <w:rPr>
+          <w:rFonts w:ascii="Arial" w:hAnsi="Arial"/>
+          <w:b/>
+          <w:color w:val="1F6FEB"/>
+          <w:sz w:val="56"/>
+        </w:rPr>
+        <w:t>LEARNER GUIDE</w:t>
+      </w:r>
+    </w:p>
+    <w:p>
+      <w:pPr>
+        <w:spacing w:after="280"/>
+        <w:jc w:val="center"/>
+      </w:pPr>
+      <w:r>
+        <w:rPr>
+          <w:rFonts w:ascii="Arial" w:hAnsi="Arial"/>
+          <w:b w:val="0"/>
+          <w:color w:val="4B5563"/>
+          <w:sz w:val="24"/>
+        </w:rPr>
+        <w:t>For</w:t>
+      </w:r>
+    </w:p>
+    <w:p>
+      <w:pPr>
+        <w:spacing w:after="160"/>
+        <w:jc w:val="center"/>
       </w:pPr>
       <w:r>
         <w:rPr>
@@ -94,41 +129,29 @@
           <w:color w:val="111827"/>
           <w:sz w:val="40"/>
         </w:rPr>
-        <w:t>LEARNER GUIDE</w:t>
-      </w:r>
-    </w:p>
-    <w:p/>
-    <w:p>
-      <w:pPr>
-        <w:jc w:val="center"/>
-      </w:pPr>
-      <w:r>
-        <w:rPr>
-          <w:rFonts w:ascii="Arial" w:hAnsi="Arial"/>
-          <w:b/>
-          <w:color w:val="111827"/>
-          <w:sz w:val="36"/>
-        </w:rPr>
         <w:t>Designing and Implementing Microsoft DevOps Solutions (AZ-400)</w:t>
       </w:r>
     </w:p>
     <w:p>
       <w:pPr>
+        <w:spacing w:after="440"/>
         <w:jc w:val="center"/>
       </w:pPr>
       <w:r>
         <w:rPr>
           <w:rFonts w:ascii="Arial" w:hAnsi="Arial"/>
           <w:b w:val="0"/>
-          <w:color w:val="4B5563"/>
-          <w:sz w:val="21"/>
+          <w:color w:val="111827"/>
+          <w:sz w:val="24"/>
         </w:rPr>
         <w:t>TGS Ref No: TGS-2024042605</w:t>
       </w:r>
     </w:p>
     <w:p>
       <w:pPr>
+        <w:spacing w:after="40"/>
         <w:jc w:val="center"/>
+        <w:shd w:fill="F3F7FB"/>
       </w:pPr>
       <w:r>
         <w:rPr>
@@ -142,6 +165,7 @@
     </w:p>
     <w:p>
       <w:pPr>
+        <w:spacing w:after="40"/>
         <w:jc w:val="center"/>
       </w:pPr>
       <w:r>
@@ -149,13 +173,14 @@
           <w:rFonts w:ascii="Arial" w:hAnsi="Arial"/>
           <w:b/>
           <w:color w:val="111827"/>
-          <w:sz w:val="21"/>
+          <w:sz w:val="22"/>
         </w:rPr>
         <w:t>Tertiary Infotech Academy Pte Ltd</w:t>
       </w:r>
     </w:p>
     <w:p>
       <w:pPr>
+        <w:spacing w:after="40"/>
         <w:jc w:val="center"/>
       </w:pPr>
       <w:r>
@@ -163,13 +188,14 @@
           <w:rFonts w:ascii="Arial" w:hAnsi="Arial"/>
           <w:b w:val="0"/>
           <w:color w:val="4B5563"/>
-          <w:sz w:val="21"/>
+          <w:sz w:val="20"/>
         </w:rPr>
         <w:t>UEN: 201200696W</w:t>
       </w:r>
     </w:p>
     <w:p>
       <w:pPr>
+        <w:spacing w:after="40"/>
         <w:jc w:val="center"/>
       </w:pPr>
       <w:r>
@@ -177,7 +203,7 @@
           <w:rFonts w:ascii="Arial" w:hAnsi="Arial"/>
           <w:b w:val="0"/>
           <w:color w:val="4B5563"/>
-          <w:sz w:val="21"/>
+          <w:sz w:val="20"/>
         </w:rPr>
         <w:t>Version 1</w:t>
       </w:r>

</xml_diff>